<commit_message>
ajuste no membros e adição do link para youtube
</commit_message>
<xml_diff>
--- a/IoT_Ia_Sprint3_Petpulse.docx
+++ b/IoT_Ia_Sprint3_Petpulse.docx
@@ -1,6 +1,6 @@
 
 <file path=word/document.xml><?xml version="1.0" encoding="utf-8"?>
-<w:document xmlns:wpc="http://schemas.microsoft.com/office/word/2010/wordprocessingCanvas" xmlns:cx="http://schemas.microsoft.com/office/drawing/2014/chartex" xmlns:cx1="http://schemas.microsoft.com/office/drawing/2015/9/8/chartex" xmlns:cx2="http://schemas.microsoft.com/office/drawing/2015/10/21/chartex" xmlns:cx3="http://schemas.microsoft.com/office/drawing/2016/5/9/chartex" xmlns:cx4="http://schemas.microsoft.com/office/drawing/2016/5/10/chartex" xmlns:cx5="http://schemas.microsoft.com/office/drawing/2016/5/11/chartex" xmlns:cx6="http://schemas.microsoft.com/office/drawing/2016/5/12/chartex" xmlns:cx7="http://schemas.microsoft.com/office/drawing/2016/5/13/chartex" xmlns:cx8="http://schemas.microsoft.com/office/drawing/2016/5/14/chartex" xmlns:mc="http://schemas.openxmlformats.org/markup-compatibility/2006" xmlns:aink="http://schemas.microsoft.com/office/drawing/2016/ink" xmlns:am3d="http://schemas.microsoft.com/office/drawing/2017/model3d" xmlns:o="urn:schemas-microsoft-com:office:office" xmlns:oel="http://schemas.microsoft.com/office/2019/extlst" xmlns:r="http://schemas.openxmlformats.org/officeDocument/2006/relationships" xmlns:m="http://schemas.openxmlformats.org/officeDocument/2006/math" xmlns:v="urn:schemas-microsoft-com:vml" xmlns:wp14="http://schemas.microsoft.com/office/word/2010/wordprocessingDrawing" xmlns:wp="http://schemas.openxmlformats.org/drawingml/2006/wordprocessingDrawing" xmlns:w10="urn:schemas-microsoft-com:office:word" xmlns:w="http://schemas.openxmlformats.org/wordprocessingml/2006/main" xmlns:w14="http://schemas.microsoft.com/office/word/2010/wordml" xmlns:w15="http://schemas.microsoft.com/office/word/2012/wordml" xmlns:w16cex="http://schemas.microsoft.com/office/word/2018/wordml/cex" xmlns:w16cid="http://schemas.microsoft.com/office/word/2016/wordml/cid" xmlns:w16="http://schemas.microsoft.com/office/word/2018/wordml" xmlns:w16du="http://schemas.microsoft.com/office/word/2023/wordml/word16du" xmlns:w16sdtdh="http://schemas.microsoft.com/office/word/2020/wordml/sdtdatahash" xmlns:w16sdtfl="http://schemas.microsoft.com/office/word/2024/wordml/sdtformatlock" xmlns:w16se="http://schemas.microsoft.com/office/word/2015/wordml/symex" xmlns:wpg="http://schemas.microsoft.com/office/word/2010/wordprocessingGroup" xmlns:wpi="http://schemas.microsoft.com/office/word/2010/wordprocessingInk" xmlns:wne="http://schemas.microsoft.com/office/word/2006/wordml" xmlns:wps="http://schemas.microsoft.com/office/word/2010/wordprocessingShape" mc:Ignorable="w14 w15 w16se w16cid w16 w16cex w16sdtdh w16sdtfl w16du wp14">
+<w:document xmlns:wpc="http://schemas.microsoft.com/office/word/2010/wordprocessingCanvas" xmlns:mc="http://schemas.openxmlformats.org/markup-compatibility/2006" xmlns:o="urn:schemas-microsoft-com:office:office" xmlns:r="http://schemas.openxmlformats.org/officeDocument/2006/relationships" xmlns:m="http://schemas.openxmlformats.org/officeDocument/2006/math" xmlns:v="urn:schemas-microsoft-com:vml" xmlns:wp14="http://schemas.microsoft.com/office/word/2010/wordprocessingDrawing" xmlns:wp="http://schemas.openxmlformats.org/drawingml/2006/wordprocessingDrawing" xmlns:w10="urn:schemas-microsoft-com:office:word" xmlns:w="http://schemas.openxmlformats.org/wordprocessingml/2006/main" xmlns:w14="http://schemas.microsoft.com/office/word/2010/wordml" xmlns:w15="http://schemas.microsoft.com/office/word/2012/wordml" xmlns:wpg="http://schemas.microsoft.com/office/word/2010/wordprocessingGroup" xmlns:wpi="http://schemas.microsoft.com/office/word/2010/wordprocessingInk" xmlns:wne="http://schemas.microsoft.com/office/word/2006/wordml" xmlns:wps="http://schemas.microsoft.com/office/word/2010/wordprocessingShape" mc:Ignorable="w14 w15 wp14">
   <w:body>
     <w:p>
       <w:pPr>
@@ -75,7 +75,10 @@
         <w:pStyle w:val="Ttulo3"/>
       </w:pPr>
       <w:r>
-        <w:t>1. Problema e Proposta de Valor</w:t>
+        <w:t xml:space="preserve">1. Problema e Proposta de </w:t>
+      </w:r>
+      <w:r>
+        <w:t>Valor</w:t>
       </w:r>
     </w:p>
     <w:p>
@@ -84,7 +87,10 @@
         <w:jc w:val="both"/>
       </w:pPr>
       <w:r>
-        <w:t>O monitoramento contínuo da saúde animal enfrenta um desafio biológico estrutural: por mecanismo evolutivo de autopreservação, animais domésticos tendem a mascarar sinais clínicos e sintomas de dor ou desconforto até que as patologias atinjam estágios avançados. Concomitantemente, a disseminação de dispositivos vestíveis (</w:t>
+        <w:t>O monitoramento contínuo da saúde animal enfrenta um desafio biológico estrutural: por mecanismo evolutivo de autopreservação, animais domésticos tendem a mascarar sinais clínicos e sintomas de dor ou desconforto até que as patologias atinjam estágio</w:t>
+      </w:r>
+      <w:r>
+        <w:t>s avançados. Concomitantemente, a disseminação de dispositivos vestíveis (</w:t>
       </w:r>
       <w:proofErr w:type="spellStart"/>
       <w:r>
@@ -106,7 +112,13 @@
         <w:t>IoT</w:t>
       </w:r>
       <w:r>
-        <w:t>) viabilizou a captura ininterrupta de telemetria biológica, gerando um volume expressivo de dados brutos. Contudo, tutores desprovidos de formação médica veterinária não possuem capacidade técnica para interpretar variações sutis nesses fluxos de dados, o que resulta invariavelmente em diagnósticos tardios, aumento substancial nos custos terapêuticos e redução no prognóstico positivo do paciente.</w:t>
+        <w:t>) viabilizou a captura ininterrupta de telemetria biológica, gerando um volume expressivo de dados brutos. Contudo, tutores desprovidos</w:t>
+      </w:r>
+      <w:r>
+        <w:t xml:space="preserve"> de formação médica veterinária não possuem capacidade técnica para interpretar variações sutis nesses fluxos de dados, o que resulta invariavelmente em diagnósticos tardios, aumento substancial nos custos terapêuticos e redução no prognóstico positivo do </w:t>
+      </w:r>
+      <w:r>
+        <w:t>paciente.</w:t>
       </w:r>
     </w:p>
     <w:p>
@@ -155,7 +167,10 @@
         <w:t>Inteligência Artificial preditiva</w:t>
       </w:r>
       <w:r>
-        <w:t>, transformando telemetria em inteligência acionável e estabelecendo uma proposição de valor trifásica:</w:t>
+        <w:t>, transformando telemetria em inteligência acionáv</w:t>
+      </w:r>
+      <w:r>
+        <w:t>el e estabelecendo uma proposição de valor trifásica:</w:t>
       </w:r>
     </w:p>
     <w:p>
@@ -195,7 +210,10 @@
         <w:t>monitoramento contínuo 24 horas</w:t>
       </w:r>
       <w:r>
-        <w:t>, eliminando a sobrecarga de vigilância ativa ou a necessidade de interpretação manual de gráficos biométricos complexos.</w:t>
+        <w:t>, eliminando a sobrecarga de vigilâ</w:t>
+      </w:r>
+      <w:r>
+        <w:t>ncia ativa ou a necessidade de interpretação manual de gráficos biométricos complexos.</w:t>
       </w:r>
     </w:p>
     <w:p>
@@ -225,7 +243,10 @@
         <w:t>histórico longitudinal completo</w:t>
       </w:r>
       <w:r>
-        <w:t xml:space="preserve"> e estruturado de dados biométricos prévios à consulta, viabilizando diagnósticos acelerados, assertivos e fundamentados na evolução real do animal, além de potencializar a </w:t>
+        <w:t xml:space="preserve"> e estruturado de dados biométricos prévios à consulta, viabilizando di</w:t>
+      </w:r>
+      <w:r>
+        <w:t xml:space="preserve">agnósticos acelerados, assertivos e fundamentados na evolução real do animal, além de potencializar a </w:t>
       </w:r>
       <w:r>
         <w:rPr>
@@ -265,7 +286,10 @@
         <w:t>intervenções clínicas precoces</w:t>
       </w:r>
       <w:r>
-        <w:t xml:space="preserve"> em fases subclínicas ou iniciais de enfermidades, mitigando quadros álgicos, reduzindo a necessidade de procedimentos invasivos de emergência e promovendo uma longevidade saudável por meio da verdadeira </w:t>
+        <w:t xml:space="preserve"> em fases subclínicas ou i</w:t>
+      </w:r>
+      <w:r>
+        <w:t xml:space="preserve">niciais de enfermidades, mitigando quadros álgicos, reduzindo a necessidade de procedimentos invasivos de emergência e promovendo uma longevidade saudável por meio da verdadeira </w:t>
       </w:r>
       <w:r>
         <w:rPr>
@@ -316,7 +340,14 @@
           <w:b/>
           <w:bCs/>
         </w:rPr>
-        <w:t>PetPulse</w:t>
+        <w:t>P</w:t>
+      </w:r>
+      <w:r>
+        <w:rPr>
+          <w:b/>
+          <w:bCs/>
+        </w:rPr>
+        <w:t>etPulse</w:t>
       </w:r>
       <w:proofErr w:type="spellEnd"/>
       <w:r>
@@ -340,7 +371,10 @@
         <w:t>Coleira Inteligente com Sensores IoT Embarcados:</w:t>
       </w:r>
       <w:r>
-        <w:t xml:space="preserve"> Dispositivo vestível não invasivo e ultraleve, equipado com biossensores de alta precisão para a captura contínua de </w:t>
+        <w:t xml:space="preserve"> Dispositivo vestível não invasi</w:t>
+      </w:r>
+      <w:r>
+        <w:t xml:space="preserve">vo e ultraleve, equipado com biossensores de alta precisão para a captura contínua de </w:t>
       </w:r>
       <w:r>
         <w:rPr>
@@ -390,7 +424,10 @@
         <w:t>Conectividade Híbrida BLE/IoT:</w:t>
       </w:r>
       <w:r>
-        <w:t xml:space="preserve"> Transmissão segura e otimizada de dados via </w:t>
+        <w:t xml:space="preserve"> Transmissão segura e otimi</w:t>
+      </w:r>
+      <w:r>
+        <w:t xml:space="preserve">zada de dados via </w:t>
       </w:r>
       <w:r>
         <w:rPr>
@@ -443,7 +480,14 @@
           <w:b/>
           <w:bCs/>
         </w:rPr>
-        <w:t>Dashboard Centralizado Unificado:</w:t>
+        <w:t>Dashboard Centralizado Unificado</w:t>
+      </w:r>
+      <w:r>
+        <w:rPr>
+          <w:b/>
+          <w:bCs/>
+        </w:rPr>
+        <w:t>:</w:t>
       </w:r>
       <w:r>
         <w:t xml:space="preserve"> Plataforma responsiva e intuitiva acessível por tutores e médicos veterinários, fornecendo visualização de séries temporais, histórico clínico, correlações fisiológicas e alertas de tendências anômalas.</w:t>
@@ -455,7 +499,10 @@
         <w:jc w:val="both"/>
       </w:pPr>
       <w:r>
-        <w:t>As principais funcionalidades operacionais da plataforma abrangem:</w:t>
+        <w:t>As principais funcionalidades operacionais da plata</w:t>
+      </w:r>
+      <w:r>
+        <w:t>forma abrangem:</w:t>
       </w:r>
     </w:p>
     <w:p>
@@ -476,7 +523,10 @@
         <w:t>Alertas Preventivos de Saúde:</w:t>
       </w:r>
       <w:r>
-        <w:t xml:space="preserve"> Notificações em tempo real enviadas ao tutor e ao veterinário responsável sempre que os parâmetros biológicos desviam da normalidade individual (ex.: taquicardia em repouso, quadros febris ou episódios de inatividade suspeita e prostração).</w:t>
+        <w:t xml:space="preserve"> Notificações em tempo real enviadas ao tutor e ao veterinário responsável sempre que os parâmetros biológicos desviam da normalidade individual (ex.: taquicardia em repouso, quadros febris ou episódios de inati</w:t>
+      </w:r>
+      <w:r>
+        <w:t>vidade suspeita e prostração).</w:t>
       </w:r>
     </w:p>
     <w:p>
@@ -546,7 +596,10 @@
         <w:t>Compartilhamento Rápido:</w:t>
       </w:r>
       <w:r>
-        <w:t xml:space="preserve"> Mecanismo de exportação e transmissão instantânea do prontuário digital completo para qualquer clínica ou especialista veterinário em um clique, otimizando atendimentos emergenciais, consultas especializadas e segundas opiniões.</w:t>
+        <w:t xml:space="preserve"> Mecanismo de exportação e transmissão instantânea do pr</w:t>
+      </w:r>
+      <w:r>
+        <w:t>ontuário digital completo para qualquer clínica ou especialista veterinário em um clique, otimizando atendimentos emergenciais, consultas especializadas e segundas opiniões.</w:t>
       </w:r>
     </w:p>
     <w:p>
@@ -593,7 +646,10 @@
         <w:t>personalização clínica real baseada no perfil individual de cada animal</w:t>
       </w:r>
       <w:r>
-        <w:t xml:space="preserve">. A arquitetura analítica fundamenta-se no paradigma de </w:t>
+        <w:t xml:space="preserve">. A arquitetura analítica fundamenta-se </w:t>
+      </w:r>
+      <w:r>
+        <w:t xml:space="preserve">no paradigma de </w:t>
       </w:r>
       <w:r>
         <w:rPr>
@@ -612,7 +668,10 @@
         <w:jc w:val="both"/>
       </w:pPr>
       <w:r>
-        <w:t xml:space="preserve">A justificativa técnica assenta-se no fato de que padrões vitais basais são intrínsecos a cada indivíduo — variando em função de porte, temperamento, idade e histórico. Modelos puramente supervisionados falham diante da escassez de dados rotulados e da extrema heterogeneidade individual. O motor analítico do </w:t>
+        <w:t>A justificativa técnica assenta-se no fato de que padrões vitais basais são intrínsecos a cada indivíduo — varia</w:t>
+      </w:r>
+      <w:r>
+        <w:t xml:space="preserve">ndo em função de porte, temperamento, idade e histórico. Modelos puramente supervisionados falham diante da escassez de dados rotulados e da extrema heterogeneidade individual. O motor analítico do </w:t>
       </w:r>
       <w:proofErr w:type="spellStart"/>
       <w:r>
@@ -647,7 +706,14 @@
           <w:b/>
           <w:bCs/>
         </w:rPr>
-        <w:t>Pilar 1 — Baseline Individual Dinâmica:</w:t>
+        <w:t xml:space="preserve">Pilar 1 — </w:t>
+      </w:r>
+      <w:r>
+        <w:rPr>
+          <w:b/>
+          <w:bCs/>
+        </w:rPr>
+        <w:t>Baseline Individual Dinâmica:</w:t>
       </w:r>
       <w:r>
         <w:t xml:space="preserve"> O sistema constrói e refina continuamente a linha de base do animal, aprendendo o que é </w:t>
@@ -758,7 +824,14 @@
           <w:b/>
           <w:bCs/>
         </w:rPr>
-        <w:t>nível de movimentação</w:t>
+        <w:t>nível de movimentaçã</w:t>
+      </w:r>
+      <w:r>
+        <w:rPr>
+          <w:b/>
+          <w:bCs/>
+        </w:rPr>
+        <w:t>o</w:t>
       </w:r>
       <w:r>
         <w:t xml:space="preserve"> instantâneo.</w:t>
@@ -796,7 +869,14 @@
           <w:i/>
           <w:iCs/>
         </w:rPr>
-        <w:t>"A frequência cardíaca da Mel subiu 30% acima do padrão dela nas últimas 6 horas durante o repouso."</w:t>
+        <w:t>"A frequência cardíaca da Mel subiu 30% acima do padrão dela nas úl</w:t>
+      </w:r>
+      <w:r>
+        <w:rPr>
+          <w:i/>
+          <w:iCs/>
+        </w:rPr>
+        <w:t>timas 6 horas durante o repouso."</w:t>
       </w:r>
       <w:r>
         <w:t>).</w:t>
@@ -815,7 +895,10 @@
       </w:r>
       <w:proofErr w:type="spellEnd"/>
       <w:r>
-        <w:t xml:space="preserve"> antecipa crises fisiológicas antes da manifestação clínica visível."</w:t>
+        <w:t xml:space="preserve"> antecipa crises fisiológicas antes da manifestação clínica vis</w:t>
+      </w:r>
+      <w:r>
+        <w:t>ível."</w:t>
       </w:r>
     </w:p>
     <w:p>
@@ -876,12 +959,6 @@
         <w:gridCol w:w="2700"/>
       </w:tblGrid>
       <w:tr>
-        <w:tblPrEx>
-          <w:tblCellMar>
-            <w:top w:w="0" w:type="dxa"/>
-            <w:bottom w:w="0" w:type="dxa"/>
-          </w:tblCellMar>
-        </w:tblPrEx>
         <w:tc>
           <w:tcPr>
             <w:tcW w:w="2700" w:type="dxa"/>
@@ -1016,12 +1093,6 @@
         </w:tc>
       </w:tr>
       <w:tr>
-        <w:tblPrEx>
-          <w:tblCellMar>
-            <w:top w:w="0" w:type="dxa"/>
-            <w:bottom w:w="0" w:type="dxa"/>
-          </w:tblCellMar>
-        </w:tblPrEx>
         <w:tc>
           <w:tcPr>
             <w:tcW w:w="2700" w:type="dxa"/>
@@ -1201,12 +1272,6 @@
         </w:tc>
       </w:tr>
       <w:tr>
-        <w:tblPrEx>
-          <w:tblCellMar>
-            <w:top w:w="0" w:type="dxa"/>
-            <w:bottom w:w="0" w:type="dxa"/>
-          </w:tblCellMar>
-        </w:tblPrEx>
         <w:tc>
           <w:tcPr>
             <w:tcW w:w="2700" w:type="dxa"/>
@@ -1234,7 +1299,16 @@
                 <w:sz w:val="20"/>
                 <w:szCs w:val="20"/>
               </w:rPr>
-              <w:t>Dados Cadastrais e Físicos</w:t>
+              <w:t>Dados Cadastrais e F</w:t>
+            </w:r>
+            <w:r>
+              <w:rPr>
+                <w:b/>
+                <w:bCs/>
+                <w:sz w:val="20"/>
+                <w:szCs w:val="20"/>
+              </w:rPr>
+              <w:t>ísicos</w:t>
             </w:r>
           </w:p>
         </w:tc>
@@ -1308,7 +1382,23 @@
                 <w:sz w:val="20"/>
                 <w:szCs w:val="20"/>
               </w:rPr>
-              <w:t>; registros relacionais (Cloud SQL).</w:t>
+              <w:t>; registros relacionais (</w:t>
+            </w:r>
+            <w:proofErr w:type="spellStart"/>
+            <w:r>
+              <w:rPr>
+                <w:sz w:val="20"/>
+                <w:szCs w:val="20"/>
+              </w:rPr>
+              <w:t>Cloud</w:t>
+            </w:r>
+            <w:proofErr w:type="spellEnd"/>
+            <w:r>
+              <w:rPr>
+                <w:sz w:val="20"/>
+                <w:szCs w:val="20"/>
+              </w:rPr>
+              <w:t xml:space="preserve"> SQL).</w:t>
             </w:r>
           </w:p>
         </w:tc>
@@ -1337,18 +1427,19 @@
                 <w:sz w:val="20"/>
                 <w:szCs w:val="20"/>
               </w:rPr>
-              <w:t>Calibração inicial de sensibilidade e ponderação dos limiares estatísticos conforme faixa etária e predisposição racial.</w:t>
+              <w:t xml:space="preserve">Calibração inicial de sensibilidade e ponderação dos limiares estatísticos </w:t>
+            </w:r>
+            <w:r>
+              <w:rPr>
+                <w:sz w:val="20"/>
+                <w:szCs w:val="20"/>
+              </w:rPr>
+              <w:t>conforme faixa etária e predisposição racial.</w:t>
             </w:r>
           </w:p>
         </w:tc>
       </w:tr>
       <w:tr>
-        <w:tblPrEx>
-          <w:tblCellMar>
-            <w:top w:w="0" w:type="dxa"/>
-            <w:bottom w:w="0" w:type="dxa"/>
-          </w:tblCellMar>
-        </w:tblPrEx>
         <w:tc>
           <w:tcPr>
             <w:tcW w:w="2700" w:type="dxa"/>
@@ -1450,7 +1541,14 @@
                 <w:sz w:val="20"/>
                 <w:szCs w:val="20"/>
               </w:rPr>
-              <w:t xml:space="preserve"> e integração via API com sistemas parceiros; dados tabulares e semiestruturados.</w:t>
+              <w:t xml:space="preserve"> e integração via API com siste</w:t>
+            </w:r>
+            <w:r>
+              <w:rPr>
+                <w:sz w:val="20"/>
+                <w:szCs w:val="20"/>
+              </w:rPr>
+              <w:t>mas parceiros; dados tabulares e semiestruturados.</w:t>
             </w:r>
           </w:p>
         </w:tc>
@@ -1543,7 +1641,10 @@
       </w:r>
       <w:proofErr w:type="spellEnd"/>
       <w:r>
-        <w:t xml:space="preserve"> captura as variáveis fisiológicas e cinemáticas via sensores embarcados (acelerômetro, giroscópio, biossensores térmicos e ópticos), transmitindo pacotes compactados via </w:t>
+        <w:t xml:space="preserve"> captura a</w:t>
+      </w:r>
+      <w:r>
+        <w:t xml:space="preserve">s variáveis fisiológicas e cinemáticas via sensores embarcados (acelerômetro, giroscópio, biossensores térmicos e ópticos), transmitindo pacotes compactados via </w:t>
       </w:r>
       <w:r>
         <w:rPr>
@@ -1576,7 +1677,14 @@
           <w:b/>
           <w:bCs/>
         </w:rPr>
-        <w:t>protocolos leves MQTT/HTTPS</w:t>
+        <w:t>protocolos leves MQTT/HTT</w:t>
+      </w:r>
+      <w:r>
+        <w:rPr>
+          <w:b/>
+          <w:bCs/>
+        </w:rPr>
+        <w:t>PS</w:t>
       </w:r>
       <w:r>
         <w:t xml:space="preserve"> em hubs dedicados.</w:t>
@@ -1609,15 +1717,7 @@
         <w:t>API Gateway</w:t>
       </w:r>
       <w:r>
-        <w:t xml:space="preserve"> recebe, </w:t>
-      </w:r>
-      <w:proofErr w:type="spellStart"/>
-      <w:r>
-        <w:t>valida</w:t>
-      </w:r>
-      <w:proofErr w:type="spellEnd"/>
-      <w:r>
-        <w:t xml:space="preserve"> a autenticidade criptográfica do hardware e encaminha os fluxos de eventos a um cluster de mensageria distribuída (</w:t>
+        <w:t xml:space="preserve"> recebe, valida a autenticidade criptográfica do hardware e encaminha os fluxos de eventos a um cluster de mensageria distribuída (</w:t>
       </w:r>
       <w:r>
         <w:rPr>
@@ -1627,7 +1727,10 @@
         <w:t>Apache Kafka</w:t>
       </w:r>
       <w:r>
-        <w:t>), garantindo ordenação estrita de séries temporais e mitigando gargalos de concorrência.</w:t>
+        <w:t>), garantindo ordenação estrita de séries tem</w:t>
+      </w:r>
+      <w:r>
+        <w:t>porais e mitigando gargalos de concorrência.</w:t>
       </w:r>
     </w:p>
     <w:p>
@@ -1698,7 +1801,10 @@
         <w:t>):</w:t>
       </w:r>
       <w:r>
-        <w:t xml:space="preserve"> Armazena telemetria bruta de alta frequência, séries temporais e eventos não estruturados de sensores.</w:t>
+        <w:t xml:space="preserve"> Armazena telemetria bruta de alta frequência, séries temporais e event</w:t>
+      </w:r>
+      <w:r>
+        <w:t>os não estruturados de sensores.</w:t>
       </w:r>
     </w:p>
     <w:p>
@@ -1784,13 +1890,28 @@
           <w:b/>
           <w:bCs/>
         </w:rPr>
-        <w:t>Camada de Aplicação, Dashboards e Alertas:</w:t>
-      </w:r>
-      <w:r>
-        <w:t xml:space="preserve"> A aplicação móvel e o painel web veterinário consomem os dados via APIs REST/</w:t>
+        <w:t>Ca</w:t>
+      </w:r>
+      <w:r>
+        <w:rPr>
+          <w:b/>
+          <w:bCs/>
+        </w:rPr>
+        <w:t>mada de Aplicação, Dashboards e Alertas:</w:t>
+      </w:r>
+      <w:r>
+        <w:t xml:space="preserve"> A aplicação móvel e o painel web veterinário consomem os dados via </w:t>
       </w:r>
       <w:proofErr w:type="spellStart"/>
       <w:r>
+        <w:t>APIs</w:t>
+      </w:r>
+      <w:proofErr w:type="spellEnd"/>
+      <w:r>
+        <w:t xml:space="preserve"> REST/</w:t>
+      </w:r>
+      <w:proofErr w:type="spellStart"/>
+      <w:r>
         <w:t>GraphQL</w:t>
       </w:r>
       <w:proofErr w:type="spellEnd"/>
@@ -1803,7 +1924,10 @@
       </w:r>
       <w:proofErr w:type="spellEnd"/>
       <w:r>
-        <w:t xml:space="preserve"> instantâneas para os tutores e atualiza o painel clínico do veterinário credenciado com o relatório contextual.</w:t>
+        <w:t xml:space="preserve"> instantâneas para os tutores e atualiza o painel clínico</w:t>
+      </w:r>
+      <w:r>
+        <w:t xml:space="preserve"> do veterinário credenciado com o relatório contextual.</w:t>
       </w:r>
     </w:p>
     <w:p>
@@ -1828,7 +1952,10 @@
         <w:jc w:val="both"/>
       </w:pPr>
       <w:r>
-        <w:t>O mercado pet global e nacional atravessa uma transformação estrutural sem precedentes, impulsionada pelo fenômeno da humanização dos animais e pela ampla adoção de tecnologias de saúde digital:</w:t>
+        <w:t>O mercado pet global e nacional atravessa uma transformação estrutural sem precedentes, impulsionada pelo fenômeno da humanização dos animais e pela ampla adoção de tecnologias</w:t>
+      </w:r>
+      <w:r>
+        <w:t xml:space="preserve"> de saúde digital:</w:t>
       </w:r>
     </w:p>
     <w:p>
@@ -1889,7 +2016,10 @@
         <w:t>Expansão Exponencial do Setor:</w:t>
       </w:r>
       <w:r>
-        <w:t xml:space="preserve"> O mercado global de </w:t>
+        <w:t xml:space="preserve"> O mercado glob</w:t>
+      </w:r>
+      <w:r>
+        <w:t xml:space="preserve">al de </w:t>
       </w:r>
       <w:proofErr w:type="spellStart"/>
       <w:r>
@@ -1951,7 +2081,10 @@
         <w:t>Janela de Oportunidade:</w:t>
       </w:r>
       <w:r>
-        <w:t xml:space="preserve"> O cruzamento da maturidade dos sensores biométricos IoT de baixo consumo com a demanda crescente por medicina preventiva posiciona o </w:t>
+        <w:t xml:space="preserve"> O cruzamento da maturidade dos sensores biométricos IoT de ba</w:t>
+      </w:r>
+      <w:r>
+        <w:t xml:space="preserve">ixo consumo com a demanda crescente por medicina preventiva posiciona o </w:t>
       </w:r>
       <w:proofErr w:type="spellStart"/>
       <w:r>
@@ -1992,7 +2125,10 @@
       </w:r>
       <w:proofErr w:type="spellEnd"/>
       <w:r>
-        <w:t xml:space="preserve"> estrutura-se sobre fluxos complementares de receita recorrente e efeitos de rede escaláveis:</w:t>
+        <w:t xml:space="preserve"> estrutura-</w:t>
+      </w:r>
+      <w:r>
+        <w:t>se sobre fluxos complementares de receita recorrente e efeitos de rede escaláveis:</w:t>
       </w:r>
     </w:p>
     <w:p>
@@ -2012,7 +2148,10 @@
         <w:t>B2C — Assinatura do Tutor (SaaS + Hardware):</w:t>
       </w:r>
       <w:r>
-        <w:t xml:space="preserve"> Comercialização da coleira inteligente integrada a planos de assinatura recorrente mensal ou anual (escalonados por porte do animal e recursos analíticos avançados), garantindo previsibilidade de receita.</w:t>
+        <w:t xml:space="preserve"> Comercialização da coleira inteligente integrada a planos de assinatura recorrente mensal ou anual (escalonados por porte do ani</w:t>
+      </w:r>
+      <w:r>
+        <w:t>mal e recursos analíticos avançados), garantindo previsibilidade de receita.</w:t>
       </w:r>
     </w:p>
     <w:p>
@@ -2040,7 +2179,10 @@
       </w:r>
       <w:proofErr w:type="spellEnd"/>
       <w:r>
-        <w:t xml:space="preserve"> para acompanhamento remoto de pacientes crônicos, pós-operatórios e suporte diagnóstico em tempo real, gerando receita recorrente e reduzindo internações de emergência evitáveis.</w:t>
+        <w:t xml:space="preserve"> para acompanhamento remoto de pacientes crônicos, pós-operatórios e suporte diagnóstico </w:t>
+      </w:r>
+      <w:r>
+        <w:t>em tempo real, gerando receita recorrente e reduzindo internações de emergência evitáveis.</w:t>
       </w:r>
     </w:p>
     <w:p>
@@ -2080,7 +2222,10 @@
         <w:t>LGPD</w:t>
       </w:r>
       <w:r>
-        <w:t>, voltados para operadoras de seguros pet, indústria farmacêutica e nutrição animal.</w:t>
+        <w:t>, volt</w:t>
+      </w:r>
+      <w:r>
+        <w:t>ados para operadoras de seguros pet, indústria farmacêutica e nutrição animal.</w:t>
       </w:r>
     </w:p>
     <w:p>
@@ -2111,7 +2256,10 @@
         <w:t>:</w:t>
       </w:r>
       <w:r>
-        <w:t xml:space="preserve"> Cada clínica parceira atrai dezenas de tutores para a base; cada tutor ativo alimenta e refina continuamente os modelos de Inteligência Artificial com novos dados biométricos, elevando a precisão do sistema e criando barreiras competitivas intransponíveis.</w:t>
+        <w:t xml:space="preserve"> Cada clínica parceira atrai dezenas de tutores para a base; cada tutor ativo alimenta e refina continuamente os modelos de Inteligência Artificial com n</w:t>
+      </w:r>
+      <w:r>
+        <w:t>ovos dados biométricos, elevando a precisão do sistema e criando barreiras competitivas intransponíveis.</w:t>
       </w:r>
     </w:p>
     <w:p>
@@ -2165,7 +2313,14 @@
           <w:b/>
           <w:bCs/>
         </w:rPr>
-        <w:t>Hiper-personalização</w:t>
+        <w:t>Hipe</w:t>
+      </w:r>
+      <w:r>
+        <w:rPr>
+          <w:b/>
+          <w:bCs/>
+        </w:rPr>
+        <w:t>r-personalização</w:t>
       </w:r>
       <w:proofErr w:type="spellEnd"/>
       <w:r>
@@ -2176,7 +2331,10 @@
         <w:t xml:space="preserve"> do Perfil Biométrico:</w:t>
       </w:r>
       <w:r>
-        <w:t xml:space="preserve"> Ao rejeitar o uso isolado de médias populacionais, cada animal possui seu modelo matemático calibrado. Esse método elimina drasticamente tanto os falsos positivos (que geram ansiedade e fadiga de alertas no tutor) quanto os falsos negativos (que ocultariam anomalias sutis em animais de parâmetros fisiológicos atípicos).</w:t>
+        <w:t xml:space="preserve"> Ao rejeitar o uso isolado de médias populacionais, cada animal possui seu modelo matemático calibrado. Esse método elimina drasticamente tanto os falsos positivos (que geram ansiedade e fadiga de alertas no tutor) qua</w:t>
+      </w:r>
+      <w:r>
+        <w:t>nto os falsos negativos (que ocultariam anomalias sutis em animais de parâmetros fisiológicos atípicos).</w:t>
       </w:r>
     </w:p>
     <w:p>
@@ -2192,7 +2350,10 @@
         <w:t>B. Matriz de Priorização e Severidade:</w:t>
       </w:r>
       <w:r>
-        <w:t xml:space="preserve"> Para garantir triagem eficiente, a IA processa desvios multivariados simultâneos e define o nível de criticidade do evento:</w:t>
+        <w:t xml:space="preserve"> Para garantir triagem eficiente, a IA processa desvios multivariados simultâneos e define o nível de criticidade</w:t>
+      </w:r>
+      <w:r>
+        <w:t xml:space="preserve"> do evento:</w:t>
       </w:r>
     </w:p>
     <w:p>
@@ -2252,7 +2413,10 @@
         <w:t>Severidade Alta / Alerta Crítico:</w:t>
       </w:r>
       <w:r>
-        <w:t xml:space="preserve"> Desvios agudos e severos (ex.: elevação abrupta da frequência cardíaca em repouso associada a pico térmico). Conduta: disparo emergencial simultâneo para tutor e clínica credenciada com orientação para socorro imediato.</w:t>
+        <w:t xml:space="preserve"> D</w:t>
+      </w:r>
+      <w:r>
+        <w:t>esvios agudos e severos (ex.: elevação abrupta da frequência cardíaca em repouso associada a pico térmico). Conduta: disparo emergencial simultâneo para tutor e clínica credenciada com orientação para socorro imediato.</w:t>
       </w:r>
     </w:p>
     <w:p>
@@ -2290,7 +2454,10 @@
       </w:r>
       <w:proofErr w:type="spellEnd"/>
       <w:r>
-        <w:t xml:space="preserve"> como uma plataforma transformadora na transição da medicina veterinária reativa para a medicina preventiva preditiva. Ao converter dados biométricos brutos em baselines individualizadas e alertas acionáveis em tempo real, o </w:t>
+        <w:t xml:space="preserve"> como uma plataforma transformadora na transição da medicina veterinária reativa para a medicina preventiva preditiva. Ao converter dados</w:t>
+      </w:r>
+      <w:r>
+        <w:t xml:space="preserve"> biométricos brutos em baselines individualizadas e alertas acionáveis em tempo real, o </w:t>
       </w:r>
       <w:proofErr w:type="spellStart"/>
       <w:r>
@@ -2298,7 +2465,10 @@
       </w:r>
       <w:proofErr w:type="spellEnd"/>
       <w:r>
-        <w:t xml:space="preserve"> soluciona o desafio histórico dos sintomas mascarados, aproxima tutores e veterinários por meio de dados transparentes e inaugura um ecossistema sustentável, altamente rentável e clinicamente indispensável.</w:t>
+        <w:t xml:space="preserve"> soluciona o desafio histórico dos sintomas mascarados, aproxima tutores e veterinários por meio de dados transparentes e inaugura um ecossistema sustentável, a</w:t>
+      </w:r>
+      <w:r>
+        <w:t>ltamente rentável e clinicamente indispensável.</w:t>
       </w:r>
     </w:p>
     <w:p>
@@ -2314,7 +2484,64 @@
         <w:pStyle w:val="Ttulo3"/>
       </w:pPr>
       <w:r>
-        <w:t xml:space="preserve">10. Equipe </w:t>
+        <w:t>10</w:t>
+      </w:r>
+      <w:r>
+        <w:t xml:space="preserve">. </w:t>
+      </w:r>
+      <w:r>
+        <w:t>Link</w:t>
+      </w:r>
+      <w:r>
+        <w:t xml:space="preserve"> </w:t>
+      </w:r>
+      <w:r>
+        <w:t xml:space="preserve">do </w:t>
+      </w:r>
+      <w:proofErr w:type="spellStart"/>
+      <w:r>
+        <w:t>youtube</w:t>
+      </w:r>
+      <w:proofErr w:type="spellEnd"/>
+      <w:r>
+        <w:t xml:space="preserve"> </w:t>
+      </w:r>
+    </w:p>
+    <w:p>
+      <w:pPr>
+        <w:pBdr>
+          <w:bottom w:val="single" w:sz="6" w:space="0" w:color="CCCCCC"/>
+        </w:pBdr>
+        <w:spacing w:before="200" w:after="200"/>
+      </w:pPr>
+      <w:hyperlink r:id="rId5" w:tgtFrame="_blank" w:tooltip="https://youtu.be/jotbG8ypawI" w:history="1">
+        <w:r>
+          <w:rPr>
+            <w:rStyle w:val="Hyperlink"/>
+            <w:rFonts w:ascii="inherit" w:hAnsi="inherit"/>
+            <w:bdr w:val="none" w:sz="0" w:space="0" w:color="auto" w:frame="1"/>
+          </w:rPr>
+          <w:t>https://youtu.be/jotbG8ypawI</w:t>
+        </w:r>
+      </w:hyperlink>
+    </w:p>
+    <w:p>
+      <w:pPr>
+        <w:pBdr>
+          <w:bottom w:val="single" w:sz="6" w:space="0" w:color="CCCCCC"/>
+        </w:pBdr>
+        <w:spacing w:before="200" w:after="200"/>
+      </w:pPr>
+    </w:p>
+    <w:p>
+      <w:pPr>
+        <w:pStyle w:val="Ttulo3"/>
+      </w:pPr>
+      <w:r>
+        <w:t>11</w:t>
+      </w:r>
+      <w:r>
+        <w:t xml:space="preserve">. Equipe </w:t>
       </w:r>
       <w:proofErr w:type="spellStart"/>
       <w:r>
@@ -2376,11 +2603,45 @@
           <w:b/>
           <w:bCs/>
         </w:rPr>
-        <w:t>Gabriel Losano</w:t>
-      </w:r>
+        <w:t xml:space="preserve">Gabriel </w:t>
+      </w:r>
+      <w:proofErr w:type="spellStart"/>
+      <w:r>
+        <w:rPr>
+          <w:b/>
+          <w:bCs/>
+        </w:rPr>
+        <w:t>Losano</w:t>
+      </w:r>
+      <w:proofErr w:type="spellEnd"/>
       <w:r>
         <w:t xml:space="preserve"> — RM564093</w:t>
       </w:r>
+    </w:p>
+    <w:p>
+      <w:pPr>
+        <w:pStyle w:val="PargrafodaLista"/>
+        <w:numPr>
+          <w:ilvl w:val="0"/>
+          <w:numId w:val="1"/>
+        </w:numPr>
+        <w:spacing w:before="40" w:after="40"/>
+      </w:pPr>
+      <w:r>
+        <w:rPr>
+          <w:b/>
+          <w:bCs/>
+        </w:rPr>
+        <w:t xml:space="preserve">Pedro de Matos </w:t>
+      </w:r>
+      <w:r>
+        <w:t xml:space="preserve">— </w:t>
+      </w:r>
+      <w:r>
+        <w:t>RM564184</w:t>
+      </w:r>
+      <w:bookmarkStart w:id="0" w:name="_GoBack"/>
+      <w:bookmarkEnd w:id="0"/>
     </w:p>
     <w:sectPr>
       <w:pgSz w:w="11906" w:h="16838"/>
@@ -2393,7 +2654,7 @@
 </file>
 
 <file path=word/numbering.xml><?xml version="1.0" encoding="utf-8"?>
-<w:numbering xmlns:wpc="http://schemas.microsoft.com/office/word/2010/wordprocessingCanvas" xmlns:cx="http://schemas.microsoft.com/office/drawing/2014/chartex" xmlns:cx1="http://schemas.microsoft.com/office/drawing/2015/9/8/chartex" xmlns:cx2="http://schemas.microsoft.com/office/drawing/2015/10/21/chartex" xmlns:cx3="http://schemas.microsoft.com/office/drawing/2016/5/9/chartex" xmlns:cx4="http://schemas.microsoft.com/office/drawing/2016/5/10/chartex" xmlns:cx5="http://schemas.microsoft.com/office/drawing/2016/5/11/chartex" xmlns:cx6="http://schemas.microsoft.com/office/drawing/2016/5/12/chartex" xmlns:cx7="http://schemas.microsoft.com/office/drawing/2016/5/13/chartex" xmlns:cx8="http://schemas.microsoft.com/office/drawing/2016/5/14/chartex" xmlns:mc="http://schemas.openxmlformats.org/markup-compatibility/2006" xmlns:aink="http://schemas.microsoft.com/office/drawing/2016/ink" xmlns:am3d="http://schemas.microsoft.com/office/drawing/2017/model3d" xmlns:o="urn:schemas-microsoft-com:office:office" xmlns:oel="http://schemas.microsoft.com/office/2019/extlst" xmlns:r="http://schemas.openxmlformats.org/officeDocument/2006/relationships" xmlns:m="http://schemas.openxmlformats.org/officeDocument/2006/math" xmlns:v="urn:schemas-microsoft-com:vml" xmlns:wp14="http://schemas.microsoft.com/office/word/2010/wordprocessingDrawing" xmlns:wp="http://schemas.openxmlformats.org/drawingml/2006/wordprocessingDrawing" xmlns:w10="urn:schemas-microsoft-com:office:word" xmlns:w="http://schemas.openxmlformats.org/wordprocessingml/2006/main" xmlns:w14="http://schemas.microsoft.com/office/word/2010/wordml" xmlns:w15="http://schemas.microsoft.com/office/word/2012/wordml" xmlns:w16cex="http://schemas.microsoft.com/office/word/2018/wordml/cex" xmlns:w16cid="http://schemas.microsoft.com/office/word/2016/wordml/cid" xmlns:w16="http://schemas.microsoft.com/office/word/2018/wordml" xmlns:w16du="http://schemas.microsoft.com/office/word/2023/wordml/word16du" xmlns:w16sdtdh="http://schemas.microsoft.com/office/word/2020/wordml/sdtdatahash" xmlns:w16sdtfl="http://schemas.microsoft.com/office/word/2024/wordml/sdtformatlock" xmlns:w16se="http://schemas.microsoft.com/office/word/2015/wordml/symex" xmlns:wpg="http://schemas.microsoft.com/office/word/2010/wordprocessingGroup" xmlns:wpi="http://schemas.microsoft.com/office/word/2010/wordprocessingInk" xmlns:wne="http://schemas.microsoft.com/office/word/2006/wordml" xmlns:wps="http://schemas.microsoft.com/office/word/2010/wordprocessingShape" mc:Ignorable="w14 w15 w16se w16cid w16 w16cex w16sdtdh w16sdtfl w16du wp14">
+<w:numbering xmlns:wpc="http://schemas.microsoft.com/office/word/2010/wordprocessingCanvas" xmlns:mc="http://schemas.openxmlformats.org/markup-compatibility/2006" xmlns:o="urn:schemas-microsoft-com:office:office" xmlns:r="http://schemas.openxmlformats.org/officeDocument/2006/relationships" xmlns:m="http://schemas.openxmlformats.org/officeDocument/2006/math" xmlns:v="urn:schemas-microsoft-com:vml" xmlns:wp14="http://schemas.microsoft.com/office/word/2010/wordprocessingDrawing" xmlns:wp="http://schemas.openxmlformats.org/drawingml/2006/wordprocessingDrawing" xmlns:w10="urn:schemas-microsoft-com:office:word" xmlns:w="http://schemas.openxmlformats.org/wordprocessingml/2006/main" xmlns:w14="http://schemas.microsoft.com/office/word/2010/wordml" xmlns:w15="http://schemas.microsoft.com/office/word/2012/wordml" xmlns:wpg="http://schemas.microsoft.com/office/word/2010/wordprocessingGroup" xmlns:wpi="http://schemas.microsoft.com/office/word/2010/wordprocessingInk" xmlns:wne="http://schemas.microsoft.com/office/word/2006/wordml" xmlns:wps="http://schemas.microsoft.com/office/word/2010/wordprocessingShape" mc:Ignorable="w14 w15 wp14">
   <w:abstractNum w:abstractNumId="0" w15:restartNumberingAfterBreak="0">
     <w:nsid w:val="565A74CF"/>
     <w:multiLevelType w:val="hybridMultilevel"/>
@@ -2534,13 +2795,13 @@
       </w:pPr>
     </w:lvl>
   </w:abstractNum>
-  <w:num w:numId="1" w16cid:durableId="575553053">
+  <w:num w:numId="1">
     <w:abstractNumId w:val="1"/>
     <w:lvlOverride w:ilvl="0">
       <w:startOverride w:val="1"/>
     </w:lvlOverride>
   </w:num>
-  <w:num w:numId="2" w16cid:durableId="1317877314">
+  <w:num w:numId="2">
     <w:abstractNumId w:val="0"/>
     <w:lvlOverride w:ilvl="0">
       <w:startOverride w:val="1"/>
@@ -2550,7 +2811,7 @@
 </file>
 
 <file path=word/styles.xml><?xml version="1.0" encoding="utf-8"?>
-<w:styles xmlns:mc="http://schemas.openxmlformats.org/markup-compatibility/2006" xmlns:r="http://schemas.openxmlformats.org/officeDocument/2006/relationships" xmlns:w="http://schemas.openxmlformats.org/wordprocessingml/2006/main" xmlns:w14="http://schemas.microsoft.com/office/word/2010/wordml" xmlns:w15="http://schemas.microsoft.com/office/word/2012/wordml" xmlns:w16cex="http://schemas.microsoft.com/office/word/2018/wordml/cex" xmlns:w16cid="http://schemas.microsoft.com/office/word/2016/wordml/cid" xmlns:w16="http://schemas.microsoft.com/office/word/2018/wordml" xmlns:w16du="http://schemas.microsoft.com/office/word/2023/wordml/word16du" xmlns:w16sdtdh="http://schemas.microsoft.com/office/word/2020/wordml/sdtdatahash" xmlns:w16sdtfl="http://schemas.microsoft.com/office/word/2024/wordml/sdtformatlock" xmlns:w16se="http://schemas.microsoft.com/office/word/2015/wordml/symex" mc:Ignorable="w14 w15 w16se w16cid w16 w16cex w16sdtdh w16sdtfl w16du">
+<w:styles xmlns:mc="http://schemas.openxmlformats.org/markup-compatibility/2006" xmlns:r="http://schemas.openxmlformats.org/officeDocument/2006/relationships" xmlns:w="http://schemas.openxmlformats.org/wordprocessingml/2006/main" xmlns:w14="http://schemas.microsoft.com/office/word/2010/wordml" xmlns:w15="http://schemas.microsoft.com/office/word/2012/wordml" mc:Ignorable="w14 w15">
   <w:docDefaults>
     <w:rPrDefault>
       <w:rPr>
@@ -2566,7 +2827,7 @@
       </w:pPr>
     </w:pPrDefault>
   </w:docDefaults>
-  <w:latentStyles w:defLockedState="0" w:defUIPriority="99" w:defSemiHidden="0" w:defUnhideWhenUsed="0" w:defQFormat="0" w:count="376">
+  <w:latentStyles w:defLockedState="0" w:defUIPriority="99" w:defSemiHidden="0" w:defUnhideWhenUsed="0" w:defQFormat="0" w:count="371">
     <w:lsdException w:name="Normal" w:uiPriority="0" w:qFormat="1"/>
     <w:lsdException w:name="heading 1" w:uiPriority="9" w:qFormat="1"/>
     <w:lsdException w:name="heading 2" w:semiHidden="1" w:uiPriority="9" w:unhideWhenUsed="1" w:qFormat="1"/>
@@ -2938,11 +3199,6 @@
     <w:lsdException w:name="List Table 5 Dark Accent 6" w:uiPriority="50"/>
     <w:lsdException w:name="List Table 6 Colorful Accent 6" w:uiPriority="51"/>
     <w:lsdException w:name="List Table 7 Colorful Accent 6" w:uiPriority="52"/>
-    <w:lsdException w:name="Mention" w:semiHidden="1" w:unhideWhenUsed="1"/>
-    <w:lsdException w:name="Smart Hyperlink" w:semiHidden="1" w:unhideWhenUsed="1"/>
-    <w:lsdException w:name="Hashtag" w:semiHidden="1" w:unhideWhenUsed="1"/>
-    <w:lsdException w:name="Unresolved Mention" w:semiHidden="1" w:unhideWhenUsed="1"/>
-    <w:lsdException w:name="Smart Link" w:semiHidden="1" w:unhideWhenUsed="1"/>
   </w:latentStyles>
   <w:style w:type="paragraph" w:default="1" w:styleId="Normal">
     <w:name w:val="Normal"/>

</xml_diff>